<commit_message>
Revise Bab 2: delay Zamzam reveal, natural trade sentence, fix akidah phrasing, softer ending
</commit_message>
<xml_diff>
--- a/download/Bab-2-FINAL.docx
+++ b/download/Bab-2-FINAL.docx
@@ -364,7 +364,23 @@
           <w:sz w:val="24"/>
           <w:szCs w:val="24"/>
         </w:rPr>
-        <w:t xml:space="preserve">Namun manusia tetap datang.</w:t>
+        <w:t xml:space="preserve">Namun manusia tetap datang. Mereka mendirikan kemah di celah-celah batu. Mereka membangun rumah-rumah sederhana dari batu dan tanah. Mereka hidup di sini. Meskipun tanahnya keras. Meskipun udaranya kering. Meskipun tidak ada alasan logis untuk memilih lembah ini daripada lembah-lembah lain yang lebih hijau dan lebih ramah.</w:t>
+      </w:r>
+    </w:p>
+    <w:p>
+      <w:pPr>
+        <w:spacing w:after="120" w:line="312"/>
+        <w:ind w:firstLine="480"/>
+        <w:jc w:val="both"/>
+      </w:pPr>
+      <w:r>
+        <w:rPr>
+          <w:rFonts w:ascii="Times New Roman" w:eastAsia="Microsoft YaHei"/>
+          <w:color w:val="000000"/>
+          <w:sz w:val="24"/>
+          <w:szCs w:val="24"/>
+        </w:rPr>
+        <w:t xml:space="preserve">Kenapa orang mau tinggal di sini?</w:t>
       </w:r>
     </w:p>
     <w:p>
@@ -380,21 +396,6 @@
           <w:szCs w:val="24"/>
         </w:rPr>
         <w:t xml:space="preserve">◆</w:t>
-      </w:r>
-    </w:p>
-    <w:p>
-      <w:pPr>
-        <w:spacing w:after="80" w:line="312"/>
-        <w:jc w:val="left"/>
-      </w:pPr>
-      <w:r>
-        <w:rPr>
-          <w:rFonts w:ascii="Times New Roman" w:eastAsia="Microsoft YaHei"/>
-          <w:color w:val="000000"/>
-          <w:sz w:val="24"/>
-          <w:szCs w:val="24"/>
-        </w:rPr>
-        <w:t xml:space="preserve">Mengapa?</w:t>
       </w:r>
     </w:p>
     <w:p>
@@ -505,7 +506,7 @@
           <w:sz w:val="24"/>
           <w:szCs w:val="24"/>
         </w:rPr>
-        <w:t xml:space="preserve">Dari selatan datang kemenyan dan emas. Dari utara datang kain dan gandum. Dari timur datang rempah dan minyak wangi. Dan dari barat, melintasi Laut Merah, datang pengaruh peradaban Mesir dan Abyssinia. Semuanya bertemu di pasar-pasar Makkah. Jazirah Arab terletak di persimpangan tiga benua. Dan Makkah terletak di persimpangan Jazirah Arab. Posisi ini bukan kebetulan.</w:t>
+        <w:t xml:space="preserve">Dari selatan datang kemenyan dan emas. Dari utara datang kain dan gandum. Dari timur datang rempah dan minyak wangi. Dan dari barat, melintasi Laut Merah, datang pengaruh peradaban Mesir dan Abyssinia. Semuanya bertemu di pasar-pasar Makkah. Jalur-jalur perdagangan itu bertemu di sini. Siapa pun yang berjalan dari selatan ke utara hampir pasti mengenal kota ini. Posisi ini bukan kebetulan.</w:t>
       </w:r>
     </w:p>
     <w:p>
@@ -649,7 +650,7 @@
           <w:sz w:val="24"/>
           <w:szCs w:val="24"/>
         </w:rPr>
-        <w:t xml:space="preserve">Kedudukan ini bukan hanya soal kekayaan. Ini soal kehormatan. Menjaga Ka’bah berarti menjadi pintu gerbang antara manusia dan Tuhan mereka. Menyediakan air bagi kafilah berarti menjadi tuan rumah bagi seluruh Jazirah Arab. Dan suku Quraisy memanfaatkan posisi ini dengan cerdik. Mereka mengadakan perjanjian dengan suku-suku lain. Perjanjian perdagangan yang menjamin keamanan kafilah Quraisy di jalur utara-selatan. Perjanjian keagamaan yang menjamin bahwa bulan-bulan suci tidak akan dilanggar oleh peperangan.</w:t>
+        <w:t xml:space="preserve">Kedudukan ini bukan hanya soal kekayaan. Ini soal kehormatan. Menjaga Ka’bah berarti memikul amanah yang dihormati oleh seluruh suku. Menyediakan air bagi kafilah berarti menjadi tuan rumah bagi seluruh Jazirah Arab. Dan suku Quraisy memanfaatkan posisi ini dengan cerdik. Mereka mengadakan perjanjian dengan suku-suku lain. Perjanjian perdagangan yang menjamin keamanan kafilah Quraisy di jalur utara-selatan. Perjanjian keagamaan yang menjamin bahwa bulan-bulan suci tidak akan dilanggar oleh peperangan.</w:t>
       </w:r>
     </w:p>
     <w:p>
@@ -731,12 +732,12 @@
           <w:sz w:val="24"/>
           <w:szCs w:val="24"/>
         </w:rPr>
-        <w:t xml:space="preserve">Di tanah yang paling kering, air menembus dari bawah. Di lembah yang paling tersembunyi, kafilah menemukan jalan. Dan di bangunan yang paling tua, orang-orang mencari Tuhan — meskipun mereka belum mengenal Allah Subhanahu wa Ta’ala sebagaimana mestinya.</w:t>
-      </w:r>
-    </w:p>
-    <w:p>
-      <w:pPr>
-        <w:spacing w:after="120" w:before="240" w:line="312"/>
+        <w:t xml:space="preserve">Air terus mengalir dari Zamzam. Kafilah terus berdatangan. Ka’bah tetap berdiri di tengah lembah itu. Dan Makkah terus menjalani hari-harinya seperti biasa.</w:t>
+      </w:r>
+    </w:p>
+    <w:p>
+      <w:pPr>
+        <w:spacing w:after="120" w:before="200" w:line="312"/>
       </w:pPr>
     </w:p>
     <w:p>
@@ -754,7 +755,7 @@
           <w:sz w:val="24"/>
           <w:szCs w:val="24"/>
         </w:rPr>
-        <w:t xml:space="preserve">Makkah sudah siap. Air sudah mengalir. Pasar sudah ramai. Ka’bah sudah berdiri. Tinggal menunggu seseorang. Seseorang yang lahir di kota ini. Yang akan mengubah segalanya.</w:t>
+        <w:t xml:space="preserve">Belum ada yang mengetahui bahwa dari kota kecil ini, sejarah dunia akan berubah.</w:t>
       </w:r>
     </w:p>
     <w:p>

</xml_diff>